<commit_message>
updated with live billing P1
</commit_message>
<xml_diff>
--- a/COMC15P1.docx
+++ b/COMC15P1.docx
@@ -175,17 +175,17 @@
         <w:rPr>
           <w:b w:val="on"/>
         </w:rPr>
-        <w:t xml:space="preserve"> Step5:Opportunity created in Identified status (ID: 1542461040 )</w:t>
-        <w:br/>
-        <w:drawing>
-          <wp:inline distT="0" distR="0" distB="0" distL="0">
-            <wp:extent cx="5524500" cy="2476500"/>
-            <wp:docPr id="4" name="Drawing 4" descr="Step5:Opportunity created in Identified status (ID: 1542461040 )"/>
-            <a:graphic xmlns:a="http://schemas.openxmlformats.org/drawingml/2006/main">
-              <a:graphicData uri="http://schemas.openxmlformats.org/drawingml/2006/picture">
-                <pic:pic xmlns:pic="http://schemas.openxmlformats.org/drawingml/2006/picture">
-                  <pic:nvPicPr>
-                    <pic:cNvPr id="0" name="Picture 4" descr="Step5:Opportunity created in Identified status (ID: 1542461040 )"/>
+        <w:t xml:space="preserve"> Step5:Opportunity created in Identified status (ID: 2705647356 )</w:t>
+        <w:br/>
+        <w:drawing>
+          <wp:inline distT="0" distR="0" distB="0" distL="0">
+            <wp:extent cx="5524500" cy="2476500"/>
+            <wp:docPr id="4" name="Drawing 4" descr="Step5:Opportunity created in Identified status (ID: 2705647356 )"/>
+            <a:graphic xmlns:a="http://schemas.openxmlformats.org/drawingml/2006/main">
+              <a:graphicData uri="http://schemas.openxmlformats.org/drawingml/2006/picture">
+                <pic:pic xmlns:pic="http://schemas.openxmlformats.org/drawingml/2006/picture">
+                  <pic:nvPicPr>
+                    <pic:cNvPr id="0" name="Picture 4" descr="Step5:Opportunity created in Identified status (ID: 2705647356 )"/>
                     <pic:cNvPicPr>
                       <a:picLocks noChangeAspect="true"/>
                     </pic:cNvPicPr>
@@ -553,23 +553,527 @@
         <w:rPr>
           <w:b w:val="on"/>
         </w:rPr>
+        <w:t xml:space="preserve"> Step12:Running Ecoes batch</w:t>
+        <w:br/>
+        <w:drawing>
+          <wp:inline distT="0" distR="0" distB="0" distL="0">
+            <wp:extent cx="5524500" cy="2476500"/>
+            <wp:docPr id="13" name="Drawing 13" descr="Step12:Running Ecoes batch"/>
+            <a:graphic xmlns:a="http://schemas.openxmlformats.org/drawingml/2006/main">
+              <a:graphicData uri="http://schemas.openxmlformats.org/drawingml/2006/picture">
+                <pic:pic xmlns:pic="http://schemas.openxmlformats.org/drawingml/2006/picture">
+                  <pic:nvPicPr>
+                    <pic:cNvPr id="0" name="Picture 13" descr="Step12:Running Ecoes batch"/>
+                    <pic:cNvPicPr>
+                      <a:picLocks noChangeAspect="true"/>
+                    </pic:cNvPicPr>
+                  </pic:nvPicPr>
+                  <pic:blipFill>
+                    <a:blip r:embed="rId15"/>
+                    <a:stretch>
+                      <a:fillRect/>
+                    </a:stretch>
+                  </pic:blipFill>
+                  <pic:spPr>
+                    <a:xfrm>
+                      <a:off x="0" y="0"/>
+                      <a:ext cx="5524500" cy="2476500"/>
+                    </a:xfrm>
+                    <a:prstGeom prst="rect">
+                      <a:avLst/>
+                    </a:prstGeom>
+                  </pic:spPr>
+                </pic:pic>
+              </a:graphicData>
+            </a:graphic>
+          </wp:inline>
+        </w:drawing>
+      </w:r>
+    </w:p>
+    <w:p>
+      <w:r>
+        <w:rPr>
+          <w:b w:val="on"/>
+        </w:rPr>
         <w:t xml:space="preserve"> Step12:RunningCM-ECCHKbatch</w:t>
         <w:br/>
         <w:drawing>
           <wp:inline distT="0" distR="0" distB="0" distL="0">
             <wp:extent cx="5524500" cy="2476500"/>
-            <wp:docPr id="13" name="Drawing 13" descr="Step12:RunningCM-ECCHKbatch"/>
-            <a:graphic xmlns:a="http://schemas.openxmlformats.org/drawingml/2006/main">
-              <a:graphicData uri="http://schemas.openxmlformats.org/drawingml/2006/picture">
-                <pic:pic xmlns:pic="http://schemas.openxmlformats.org/drawingml/2006/picture">
-                  <pic:nvPicPr>
-                    <pic:cNvPr id="0" name="Picture 13" descr="Step12:RunningCM-ECCHKbatch"/>
-                    <pic:cNvPicPr>
-                      <a:picLocks noChangeAspect="true"/>
-                    </pic:cNvPicPr>
-                  </pic:nvPicPr>
-                  <pic:blipFill>
-                    <a:blip r:embed="rId15"/>
+            <wp:docPr id="14" name="Drawing 14" descr="Step12:RunningCM-ECCHKbatch"/>
+            <a:graphic xmlns:a="http://schemas.openxmlformats.org/drawingml/2006/main">
+              <a:graphicData uri="http://schemas.openxmlformats.org/drawingml/2006/picture">
+                <pic:pic xmlns:pic="http://schemas.openxmlformats.org/drawingml/2006/picture">
+                  <pic:nvPicPr>
+                    <pic:cNvPr id="0" name="Picture 14" descr="Step12:RunningCM-ECCHKbatch"/>
+                    <pic:cNvPicPr>
+                      <a:picLocks noChangeAspect="true"/>
+                    </pic:cNvPicPr>
+                  </pic:nvPicPr>
+                  <pic:blipFill>
+                    <a:blip r:embed="rId16"/>
+                    <a:stretch>
+                      <a:fillRect/>
+                    </a:stretch>
+                  </pic:blipFill>
+                  <pic:spPr>
+                    <a:xfrm>
+                      <a:off x="0" y="0"/>
+                      <a:ext cx="5524500" cy="2476500"/>
+                    </a:xfrm>
+                    <a:prstGeom prst="rect">
+                      <a:avLst/>
+                    </a:prstGeom>
+                  </pic:spPr>
+                </pic:pic>
+              </a:graphicData>
+            </a:graphic>
+          </wp:inline>
+        </w:drawing>
+      </w:r>
+    </w:p>
+    <w:p>
+      <w:r>
+        <w:rPr>
+          <w:b w:val="on"/>
+        </w:rPr>
+        <w:t xml:space="preserve"> Step12:Running Ecoes batch</w:t>
+        <w:br/>
+        <w:drawing>
+          <wp:inline distT="0" distR="0" distB="0" distL="0">
+            <wp:extent cx="5524500" cy="2476500"/>
+            <wp:docPr id="15" name="Drawing 15" descr="Step12:Running Ecoes batch"/>
+            <a:graphic xmlns:a="http://schemas.openxmlformats.org/drawingml/2006/main">
+              <a:graphicData uri="http://schemas.openxmlformats.org/drawingml/2006/picture">
+                <pic:pic xmlns:pic="http://schemas.openxmlformats.org/drawingml/2006/picture">
+                  <pic:nvPicPr>
+                    <pic:cNvPr id="0" name="Picture 15" descr="Step12:Running Ecoes batch"/>
+                    <pic:cNvPicPr>
+                      <a:picLocks noChangeAspect="true"/>
+                    </pic:cNvPicPr>
+                  </pic:nvPicPr>
+                  <pic:blipFill>
+                    <a:blip r:embed="rId17"/>
+                    <a:stretch>
+                      <a:fillRect/>
+                    </a:stretch>
+                  </pic:blipFill>
+                  <pic:spPr>
+                    <a:xfrm>
+                      <a:off x="0" y="0"/>
+                      <a:ext cx="5524500" cy="2476500"/>
+                    </a:xfrm>
+                    <a:prstGeom prst="rect">
+                      <a:avLst/>
+                    </a:prstGeom>
+                  </pic:spPr>
+                </pic:pic>
+              </a:graphicData>
+            </a:graphic>
+          </wp:inline>
+        </w:drawing>
+      </w:r>
+    </w:p>
+    <w:p>
+      <w:r>
+        <w:rPr>
+          <w:b w:val="on"/>
+        </w:rPr>
+        <w:t xml:space="preserve"> Step12:Running Ecoes batch</w:t>
+        <w:br/>
+        <w:drawing>
+          <wp:inline distT="0" distR="0" distB="0" distL="0">
+            <wp:extent cx="5524500" cy="2476500"/>
+            <wp:docPr id="16" name="Drawing 16" descr="Step12:Running Ecoes batch"/>
+            <a:graphic xmlns:a="http://schemas.openxmlformats.org/drawingml/2006/main">
+              <a:graphicData uri="http://schemas.openxmlformats.org/drawingml/2006/picture">
+                <pic:pic xmlns:pic="http://schemas.openxmlformats.org/drawingml/2006/picture">
+                  <pic:nvPicPr>
+                    <pic:cNvPr id="0" name="Picture 16" descr="Step12:Running Ecoes batch"/>
+                    <pic:cNvPicPr>
+                      <a:picLocks noChangeAspect="true"/>
+                    </pic:cNvPicPr>
+                  </pic:nvPicPr>
+                  <pic:blipFill>
+                    <a:blip r:embed="rId18"/>
+                    <a:stretch>
+                      <a:fillRect/>
+                    </a:stretch>
+                  </pic:blipFill>
+                  <pic:spPr>
+                    <a:xfrm>
+                      <a:off x="0" y="0"/>
+                      <a:ext cx="5524500" cy="2476500"/>
+                    </a:xfrm>
+                    <a:prstGeom prst="rect">
+                      <a:avLst/>
+                    </a:prstGeom>
+                  </pic:spPr>
+                </pic:pic>
+              </a:graphicData>
+            </a:graphic>
+          </wp:inline>
+        </w:drawing>
+      </w:r>
+    </w:p>
+    <w:p>
+      <w:r>
+        <w:rPr>
+          <w:b w:val="on"/>
+        </w:rPr>
+        <w:t xml:space="preserve"> Step12:RunningCMCROPSPbatch</w:t>
+        <w:br/>
+        <w:drawing>
+          <wp:inline distT="0" distR="0" distB="0" distL="0">
+            <wp:extent cx="5524500" cy="2476500"/>
+            <wp:docPr id="17" name="Drawing 17" descr="Step12:RunningCMCROPSPbatch"/>
+            <a:graphic xmlns:a="http://schemas.openxmlformats.org/drawingml/2006/main">
+              <a:graphicData uri="http://schemas.openxmlformats.org/drawingml/2006/picture">
+                <pic:pic xmlns:pic="http://schemas.openxmlformats.org/drawingml/2006/picture">
+                  <pic:nvPicPr>
+                    <pic:cNvPr id="0" name="Picture 17" descr="Step12:RunningCMCROPSPbatch"/>
+                    <pic:cNvPicPr>
+                      <a:picLocks noChangeAspect="true"/>
+                    </pic:cNvPicPr>
+                  </pic:nvPicPr>
+                  <pic:blipFill>
+                    <a:blip r:embed="rId19"/>
+                    <a:stretch>
+                      <a:fillRect/>
+                    </a:stretch>
+                  </pic:blipFill>
+                  <pic:spPr>
+                    <a:xfrm>
+                      <a:off x="0" y="0"/>
+                      <a:ext cx="5524500" cy="2476500"/>
+                    </a:xfrm>
+                    <a:prstGeom prst="rect">
+                      <a:avLst/>
+                    </a:prstGeom>
+                  </pic:spPr>
+                </pic:pic>
+              </a:graphicData>
+            </a:graphic>
+          </wp:inline>
+        </w:drawing>
+      </w:r>
+    </w:p>
+    <w:p>
+      <w:r>
+        <w:rPr>
+          <w:b w:val="on"/>
+        </w:rPr>
+        <w:t xml:space="preserve"> Step12:Running Ecoes batch</w:t>
+        <w:br/>
+        <w:drawing>
+          <wp:inline distT="0" distR="0" distB="0" distL="0">
+            <wp:extent cx="5524500" cy="2476500"/>
+            <wp:docPr id="18" name="Drawing 18" descr="Step12:Running Ecoes batch"/>
+            <a:graphic xmlns:a="http://schemas.openxmlformats.org/drawingml/2006/main">
+              <a:graphicData uri="http://schemas.openxmlformats.org/drawingml/2006/picture">
+                <pic:pic xmlns:pic="http://schemas.openxmlformats.org/drawingml/2006/picture">
+                  <pic:nvPicPr>
+                    <pic:cNvPr id="0" name="Picture 18" descr="Step12:Running Ecoes batch"/>
+                    <pic:cNvPicPr>
+                      <a:picLocks noChangeAspect="true"/>
+                    </pic:cNvPicPr>
+                  </pic:nvPicPr>
+                  <pic:blipFill>
+                    <a:blip r:embed="rId20"/>
+                    <a:stretch>
+                      <a:fillRect/>
+                    </a:stretch>
+                  </pic:blipFill>
+                  <pic:spPr>
+                    <a:xfrm>
+                      <a:off x="0" y="0"/>
+                      <a:ext cx="5524500" cy="2476500"/>
+                    </a:xfrm>
+                    <a:prstGeom prst="rect">
+                      <a:avLst/>
+                    </a:prstGeom>
+                  </pic:spPr>
+                </pic:pic>
+              </a:graphicData>
+            </a:graphic>
+          </wp:inline>
+        </w:drawing>
+      </w:r>
+    </w:p>
+    <w:p>
+      <w:r>
+        <w:rPr>
+          <w:b w:val="on"/>
+        </w:rPr>
+        <w:t xml:space="preserve"> Step12:RunningCMRPGENbatch</w:t>
+        <w:br/>
+        <w:drawing>
+          <wp:inline distT="0" distR="0" distB="0" distL="0">
+            <wp:extent cx="5524500" cy="2476500"/>
+            <wp:docPr id="19" name="Drawing 19" descr="Step12:RunningCMRPGENbatch"/>
+            <a:graphic xmlns:a="http://schemas.openxmlformats.org/drawingml/2006/main">
+              <a:graphicData uri="http://schemas.openxmlformats.org/drawingml/2006/picture">
+                <pic:pic xmlns:pic="http://schemas.openxmlformats.org/drawingml/2006/picture">
+                  <pic:nvPicPr>
+                    <pic:cNvPr id="0" name="Picture 19" descr="Step12:RunningCMRPGENbatch"/>
+                    <pic:cNvPicPr>
+                      <a:picLocks noChangeAspect="true"/>
+                    </pic:cNvPicPr>
+                  </pic:nvPicPr>
+                  <pic:blipFill>
+                    <a:blip r:embed="rId21"/>
+                    <a:stretch>
+                      <a:fillRect/>
+                    </a:stretch>
+                  </pic:blipFill>
+                  <pic:spPr>
+                    <a:xfrm>
+                      <a:off x="0" y="0"/>
+                      <a:ext cx="5524500" cy="2476500"/>
+                    </a:xfrm>
+                    <a:prstGeom prst="rect">
+                      <a:avLst/>
+                    </a:prstGeom>
+                  </pic:spPr>
+                </pic:pic>
+              </a:graphicData>
+            </a:graphic>
+          </wp:inline>
+        </w:drawing>
+      </w:r>
+    </w:p>
+    <w:p>
+      <w:r>
+        <w:rPr>
+          <w:b w:val="on"/>
+        </w:rPr>
+        <w:t xml:space="preserve"> Step12:Running Ecoes batch</w:t>
+        <w:br/>
+        <w:drawing>
+          <wp:inline distT="0" distR="0" distB="0" distL="0">
+            <wp:extent cx="5524500" cy="2476500"/>
+            <wp:docPr id="20" name="Drawing 20" descr="Step12:Running Ecoes batch"/>
+            <a:graphic xmlns:a="http://schemas.openxmlformats.org/drawingml/2006/main">
+              <a:graphicData uri="http://schemas.openxmlformats.org/drawingml/2006/picture">
+                <pic:pic xmlns:pic="http://schemas.openxmlformats.org/drawingml/2006/picture">
+                  <pic:nvPicPr>
+                    <pic:cNvPr id="0" name="Picture 20" descr="Step12:Running Ecoes batch"/>
+                    <pic:cNvPicPr>
+                      <a:picLocks noChangeAspect="true"/>
+                    </pic:cNvPicPr>
+                  </pic:nvPicPr>
+                  <pic:blipFill>
+                    <a:blip r:embed="rId22"/>
+                    <a:stretch>
+                      <a:fillRect/>
+                    </a:stretch>
+                  </pic:blipFill>
+                  <pic:spPr>
+                    <a:xfrm>
+                      <a:off x="0" y="0"/>
+                      <a:ext cx="5524500" cy="2476500"/>
+                    </a:xfrm>
+                    <a:prstGeom prst="rect">
+                      <a:avLst/>
+                    </a:prstGeom>
+                  </pic:spPr>
+                </pic:pic>
+              </a:graphicData>
+            </a:graphic>
+          </wp:inline>
+        </w:drawing>
+      </w:r>
+    </w:p>
+    <w:p>
+      <w:r>
+        <w:rPr>
+          <w:b w:val="on"/>
+        </w:rPr>
+        <w:t xml:space="preserve"> Step12:Running Ecoes batch</w:t>
+        <w:br/>
+        <w:drawing>
+          <wp:inline distT="0" distR="0" distB="0" distL="0">
+            <wp:extent cx="5524500" cy="2476500"/>
+            <wp:docPr id="21" name="Drawing 21" descr="Step12:Running Ecoes batch"/>
+            <a:graphic xmlns:a="http://schemas.openxmlformats.org/drawingml/2006/main">
+              <a:graphicData uri="http://schemas.openxmlformats.org/drawingml/2006/picture">
+                <pic:pic xmlns:pic="http://schemas.openxmlformats.org/drawingml/2006/picture">
+                  <pic:nvPicPr>
+                    <pic:cNvPr id="0" name="Picture 21" descr="Step12:Running Ecoes batch"/>
+                    <pic:cNvPicPr>
+                      <a:picLocks noChangeAspect="true"/>
+                    </pic:cNvPicPr>
+                  </pic:nvPicPr>
+                  <pic:blipFill>
+                    <a:blip r:embed="rId23"/>
+                    <a:stretch>
+                      <a:fillRect/>
+                    </a:stretch>
+                  </pic:blipFill>
+                  <pic:spPr>
+                    <a:xfrm>
+                      <a:off x="0" y="0"/>
+                      <a:ext cx="5524500" cy="2476500"/>
+                    </a:xfrm>
+                    <a:prstGeom prst="rect">
+                      <a:avLst/>
+                    </a:prstGeom>
+                  </pic:spPr>
+                </pic:pic>
+              </a:graphicData>
+            </a:graphic>
+          </wp:inline>
+        </w:drawing>
+      </w:r>
+    </w:p>
+    <w:p>
+      <w:r>
+        <w:rPr>
+          <w:b w:val="on"/>
+        </w:rPr>
+        <w:t xml:space="preserve"> Step12:RunningCMCROPSPbatch</w:t>
+        <w:br/>
+        <w:drawing>
+          <wp:inline distT="0" distR="0" distB="0" distL="0">
+            <wp:extent cx="5524500" cy="2476500"/>
+            <wp:docPr id="22" name="Drawing 22" descr="Step12:RunningCMCROPSPbatch"/>
+            <a:graphic xmlns:a="http://schemas.openxmlformats.org/drawingml/2006/main">
+              <a:graphicData uri="http://schemas.openxmlformats.org/drawingml/2006/picture">
+                <pic:pic xmlns:pic="http://schemas.openxmlformats.org/drawingml/2006/picture">
+                  <pic:nvPicPr>
+                    <pic:cNvPr id="0" name="Picture 22" descr="Step12:RunningCMCROPSPbatch"/>
+                    <pic:cNvPicPr>
+                      <a:picLocks noChangeAspect="true"/>
+                    </pic:cNvPicPr>
+                  </pic:nvPicPr>
+                  <pic:blipFill>
+                    <a:blip r:embed="rId24"/>
+                    <a:stretch>
+                      <a:fillRect/>
+                    </a:stretch>
+                  </pic:blipFill>
+                  <pic:spPr>
+                    <a:xfrm>
+                      <a:off x="0" y="0"/>
+                      <a:ext cx="5524500" cy="2476500"/>
+                    </a:xfrm>
+                    <a:prstGeom prst="rect">
+                      <a:avLst/>
+                    </a:prstGeom>
+                  </pic:spPr>
+                </pic:pic>
+              </a:graphicData>
+            </a:graphic>
+          </wp:inline>
+        </w:drawing>
+      </w:r>
+    </w:p>
+    <w:p>
+      <w:r>
+        <w:rPr>
+          <w:b w:val="on"/>
+        </w:rPr>
+        <w:t xml:space="preserve"> Step12:Running Ecoes batch</w:t>
+        <w:br/>
+        <w:drawing>
+          <wp:inline distT="0" distR="0" distB="0" distL="0">
+            <wp:extent cx="5524500" cy="2476500"/>
+            <wp:docPr id="23" name="Drawing 23" descr="Step12:Running Ecoes batch"/>
+            <a:graphic xmlns:a="http://schemas.openxmlformats.org/drawingml/2006/main">
+              <a:graphicData uri="http://schemas.openxmlformats.org/drawingml/2006/picture">
+                <pic:pic xmlns:pic="http://schemas.openxmlformats.org/drawingml/2006/picture">
+                  <pic:nvPicPr>
+                    <pic:cNvPr id="0" name="Picture 23" descr="Step12:Running Ecoes batch"/>
+                    <pic:cNvPicPr>
+                      <a:picLocks noChangeAspect="true"/>
+                    </pic:cNvPicPr>
+                  </pic:nvPicPr>
+                  <pic:blipFill>
+                    <a:blip r:embed="rId25"/>
+                    <a:stretch>
+                      <a:fillRect/>
+                    </a:stretch>
+                  </pic:blipFill>
+                  <pic:spPr>
+                    <a:xfrm>
+                      <a:off x="0" y="0"/>
+                      <a:ext cx="5524500" cy="2476500"/>
+                    </a:xfrm>
+                    <a:prstGeom prst="rect">
+                      <a:avLst/>
+                    </a:prstGeom>
+                  </pic:spPr>
+                </pic:pic>
+              </a:graphicData>
+            </a:graphic>
+          </wp:inline>
+        </w:drawing>
+      </w:r>
+    </w:p>
+    <w:p>
+      <w:r>
+        <w:rPr>
+          <w:b w:val="on"/>
+        </w:rPr>
+        <w:t xml:space="preserve"> Step12:RunningCMRPGENbatch</w:t>
+        <w:br/>
+        <w:drawing>
+          <wp:inline distT="0" distR="0" distB="0" distL="0">
+            <wp:extent cx="5524500" cy="2476500"/>
+            <wp:docPr id="24" name="Drawing 24" descr="Step12:RunningCMRPGENbatch"/>
+            <a:graphic xmlns:a="http://schemas.openxmlformats.org/drawingml/2006/main">
+              <a:graphicData uri="http://schemas.openxmlformats.org/drawingml/2006/picture">
+                <pic:pic xmlns:pic="http://schemas.openxmlformats.org/drawingml/2006/picture">
+                  <pic:nvPicPr>
+                    <pic:cNvPr id="0" name="Picture 24" descr="Step12:RunningCMRPGENbatch"/>
+                    <pic:cNvPicPr>
+                      <a:picLocks noChangeAspect="true"/>
+                    </pic:cNvPicPr>
+                  </pic:nvPicPr>
+                  <pic:blipFill>
+                    <a:blip r:embed="rId26"/>
+                    <a:stretch>
+                      <a:fillRect/>
+                    </a:stretch>
+                  </pic:blipFill>
+                  <pic:spPr>
+                    <a:xfrm>
+                      <a:off x="0" y="0"/>
+                      <a:ext cx="5524500" cy="2476500"/>
+                    </a:xfrm>
+                    <a:prstGeom prst="rect">
+                      <a:avLst/>
+                    </a:prstGeom>
+                  </pic:spPr>
+                </pic:pic>
+              </a:graphicData>
+            </a:graphic>
+          </wp:inline>
+        </w:drawing>
+      </w:r>
+    </w:p>
+    <w:p>
+      <w:r>
+        <w:rPr>
+          <w:b w:val="on"/>
+        </w:rPr>
+        <w:t xml:space="preserve"> Step12:Running Ecoes batch</w:t>
+        <w:br/>
+        <w:drawing>
+          <wp:inline distT="0" distR="0" distB="0" distL="0">
+            <wp:extent cx="5524500" cy="2476500"/>
+            <wp:docPr id="25" name="Drawing 25" descr="Step12:Running Ecoes batch"/>
+            <a:graphic xmlns:a="http://schemas.openxmlformats.org/drawingml/2006/main">
+              <a:graphicData uri="http://schemas.openxmlformats.org/drawingml/2006/picture">
+                <pic:pic xmlns:pic="http://schemas.openxmlformats.org/drawingml/2006/picture">
+                  <pic:nvPicPr>
+                    <pic:cNvPr id="0" name="Picture 25" descr="Step12:Running Ecoes batch"/>
+                    <pic:cNvPicPr>
+                      <a:picLocks noChangeAspect="true"/>
+                    </pic:cNvPicPr>
+                  </pic:nvPicPr>
+                  <pic:blipFill>
+                    <a:blip r:embed="rId27"/>
                     <a:stretch>
                       <a:fillRect/>
                     </a:stretch>

</xml_diff>

<commit_message>
commit with random name
</commit_message>
<xml_diff>
--- a/COMC15P1.docx
+++ b/COMC15P1.docx
@@ -1010,6 +1010,1098 @@
         </w:drawing>
       </w:r>
     </w:p>
+    <w:p>
+      <w:r>
+        <w:rPr>
+          <w:b w:val="on"/>
+        </w:rPr>
+        <w:t xml:space="preserve"> Step12:RunningCM-ECCHKbatch</w:t>
+        <w:br/>
+        <w:drawing>
+          <wp:inline distT="0" distR="0" distB="0" distL="0">
+            <wp:extent cx="5524500" cy="2476500"/>
+            <wp:docPr id="24" name="Drawing 24" descr="Step12:RunningCM-ECCHKbatch"/>
+            <a:graphic xmlns:a="http://schemas.openxmlformats.org/drawingml/2006/main">
+              <a:graphicData uri="http://schemas.openxmlformats.org/drawingml/2006/picture">
+                <pic:pic xmlns:pic="http://schemas.openxmlformats.org/drawingml/2006/picture">
+                  <pic:nvPicPr>
+                    <pic:cNvPr id="0" name="Picture 24" descr="Step12:RunningCM-ECCHKbatch"/>
+                    <pic:cNvPicPr>
+                      <a:picLocks noChangeAspect="true"/>
+                    </pic:cNvPicPr>
+                  </pic:nvPicPr>
+                  <pic:blipFill>
+                    <a:blip r:embed="rId26"/>
+                    <a:stretch>
+                      <a:fillRect/>
+                    </a:stretch>
+                  </pic:blipFill>
+                  <pic:spPr>
+                    <a:xfrm>
+                      <a:off x="0" y="0"/>
+                      <a:ext cx="5524500" cy="2476500"/>
+                    </a:xfrm>
+                    <a:prstGeom prst="rect">
+                      <a:avLst/>
+                    </a:prstGeom>
+                  </pic:spPr>
+                </pic:pic>
+              </a:graphicData>
+            </a:graphic>
+          </wp:inline>
+        </w:drawing>
+      </w:r>
+    </w:p>
+    <w:p>
+      <w:r>
+        <w:rPr>
+          <w:b w:val="on"/>
+        </w:rPr>
+        <w:t xml:space="preserve"> Step12:Running Ecoes batch</w:t>
+        <w:br/>
+        <w:drawing>
+          <wp:inline distT="0" distR="0" distB="0" distL="0">
+            <wp:extent cx="5524500" cy="2476500"/>
+            <wp:docPr id="25" name="Drawing 25" descr="Step12:Running Ecoes batch"/>
+            <a:graphic xmlns:a="http://schemas.openxmlformats.org/drawingml/2006/main">
+              <a:graphicData uri="http://schemas.openxmlformats.org/drawingml/2006/picture">
+                <pic:pic xmlns:pic="http://schemas.openxmlformats.org/drawingml/2006/picture">
+                  <pic:nvPicPr>
+                    <pic:cNvPr id="0" name="Picture 25" descr="Step12:Running Ecoes batch"/>
+                    <pic:cNvPicPr>
+                      <a:picLocks noChangeAspect="true"/>
+                    </pic:cNvPicPr>
+                  </pic:nvPicPr>
+                  <pic:blipFill>
+                    <a:blip r:embed="rId27"/>
+                    <a:stretch>
+                      <a:fillRect/>
+                    </a:stretch>
+                  </pic:blipFill>
+                  <pic:spPr>
+                    <a:xfrm>
+                      <a:off x="0" y="0"/>
+                      <a:ext cx="5524500" cy="2476500"/>
+                    </a:xfrm>
+                    <a:prstGeom prst="rect">
+                      <a:avLst/>
+                    </a:prstGeom>
+                  </pic:spPr>
+                </pic:pic>
+              </a:graphicData>
+            </a:graphic>
+          </wp:inline>
+        </w:drawing>
+      </w:r>
+    </w:p>
+    <w:p>
+      <w:r>
+        <w:rPr>
+          <w:b w:val="on"/>
+        </w:rPr>
+        <w:t xml:space="preserve"> Step12:RunningCM-ECCHKbatch</w:t>
+        <w:br/>
+        <w:drawing>
+          <wp:inline distT="0" distR="0" distB="0" distL="0">
+            <wp:extent cx="5524500" cy="2476500"/>
+            <wp:docPr id="26" name="Drawing 26" descr="Step12:RunningCM-ECCHKbatch"/>
+            <a:graphic xmlns:a="http://schemas.openxmlformats.org/drawingml/2006/main">
+              <a:graphicData uri="http://schemas.openxmlformats.org/drawingml/2006/picture">
+                <pic:pic xmlns:pic="http://schemas.openxmlformats.org/drawingml/2006/picture">
+                  <pic:nvPicPr>
+                    <pic:cNvPr id="0" name="Picture 26" descr="Step12:RunningCM-ECCHKbatch"/>
+                    <pic:cNvPicPr>
+                      <a:picLocks noChangeAspect="true"/>
+                    </pic:cNvPicPr>
+                  </pic:nvPicPr>
+                  <pic:blipFill>
+                    <a:blip r:embed="rId28"/>
+                    <a:stretch>
+                      <a:fillRect/>
+                    </a:stretch>
+                  </pic:blipFill>
+                  <pic:spPr>
+                    <a:xfrm>
+                      <a:off x="0" y="0"/>
+                      <a:ext cx="5524500" cy="2476500"/>
+                    </a:xfrm>
+                    <a:prstGeom prst="rect">
+                      <a:avLst/>
+                    </a:prstGeom>
+                  </pic:spPr>
+                </pic:pic>
+              </a:graphicData>
+            </a:graphic>
+          </wp:inline>
+        </w:drawing>
+      </w:r>
+    </w:p>
+    <w:p>
+      <w:r>
+        <w:rPr>
+          <w:b w:val="on"/>
+        </w:rPr>
+        <w:t xml:space="preserve"> Step12:Running Ecoes batch</w:t>
+        <w:br/>
+        <w:drawing>
+          <wp:inline distT="0" distR="0" distB="0" distL="0">
+            <wp:extent cx="5524500" cy="2476500"/>
+            <wp:docPr id="27" name="Drawing 27" descr="Step12:Running Ecoes batch"/>
+            <a:graphic xmlns:a="http://schemas.openxmlformats.org/drawingml/2006/main">
+              <a:graphicData uri="http://schemas.openxmlformats.org/drawingml/2006/picture">
+                <pic:pic xmlns:pic="http://schemas.openxmlformats.org/drawingml/2006/picture">
+                  <pic:nvPicPr>
+                    <pic:cNvPr id="0" name="Picture 27" descr="Step12:Running Ecoes batch"/>
+                    <pic:cNvPicPr>
+                      <a:picLocks noChangeAspect="true"/>
+                    </pic:cNvPicPr>
+                  </pic:nvPicPr>
+                  <pic:blipFill>
+                    <a:blip r:embed="rId29"/>
+                    <a:stretch>
+                      <a:fillRect/>
+                    </a:stretch>
+                  </pic:blipFill>
+                  <pic:spPr>
+                    <a:xfrm>
+                      <a:off x="0" y="0"/>
+                      <a:ext cx="5524500" cy="2476500"/>
+                    </a:xfrm>
+                    <a:prstGeom prst="rect">
+                      <a:avLst/>
+                    </a:prstGeom>
+                  </pic:spPr>
+                </pic:pic>
+              </a:graphicData>
+            </a:graphic>
+          </wp:inline>
+        </w:drawing>
+      </w:r>
+    </w:p>
+    <w:p>
+      <w:r>
+        <w:rPr>
+          <w:b w:val="on"/>
+        </w:rPr>
+        <w:t xml:space="preserve"> Step12:RunningCM-ECCHKbatch</w:t>
+        <w:br/>
+        <w:drawing>
+          <wp:inline distT="0" distR="0" distB="0" distL="0">
+            <wp:extent cx="5524500" cy="2476500"/>
+            <wp:docPr id="28" name="Drawing 28" descr="Step12:RunningCM-ECCHKbatch"/>
+            <a:graphic xmlns:a="http://schemas.openxmlformats.org/drawingml/2006/main">
+              <a:graphicData uri="http://schemas.openxmlformats.org/drawingml/2006/picture">
+                <pic:pic xmlns:pic="http://schemas.openxmlformats.org/drawingml/2006/picture">
+                  <pic:nvPicPr>
+                    <pic:cNvPr id="0" name="Picture 28" descr="Step12:RunningCM-ECCHKbatch"/>
+                    <pic:cNvPicPr>
+                      <a:picLocks noChangeAspect="true"/>
+                    </pic:cNvPicPr>
+                  </pic:nvPicPr>
+                  <pic:blipFill>
+                    <a:blip r:embed="rId30"/>
+                    <a:stretch>
+                      <a:fillRect/>
+                    </a:stretch>
+                  </pic:blipFill>
+                  <pic:spPr>
+                    <a:xfrm>
+                      <a:off x="0" y="0"/>
+                      <a:ext cx="5524500" cy="2476500"/>
+                    </a:xfrm>
+                    <a:prstGeom prst="rect">
+                      <a:avLst/>
+                    </a:prstGeom>
+                  </pic:spPr>
+                </pic:pic>
+              </a:graphicData>
+            </a:graphic>
+          </wp:inline>
+        </w:drawing>
+      </w:r>
+    </w:p>
+    <w:p>
+      <w:r>
+        <w:rPr>
+          <w:b w:val="on"/>
+        </w:rPr>
+        <w:t xml:space="preserve"> Step12:Running Ecoes batch</w:t>
+        <w:br/>
+        <w:drawing>
+          <wp:inline distT="0" distR="0" distB="0" distL="0">
+            <wp:extent cx="5524500" cy="2476500"/>
+            <wp:docPr id="29" name="Drawing 29" descr="Step12:Running Ecoes batch"/>
+            <a:graphic xmlns:a="http://schemas.openxmlformats.org/drawingml/2006/main">
+              <a:graphicData uri="http://schemas.openxmlformats.org/drawingml/2006/picture">
+                <pic:pic xmlns:pic="http://schemas.openxmlformats.org/drawingml/2006/picture">
+                  <pic:nvPicPr>
+                    <pic:cNvPr id="0" name="Picture 29" descr="Step12:Running Ecoes batch"/>
+                    <pic:cNvPicPr>
+                      <a:picLocks noChangeAspect="true"/>
+                    </pic:cNvPicPr>
+                  </pic:nvPicPr>
+                  <pic:blipFill>
+                    <a:blip r:embed="rId31"/>
+                    <a:stretch>
+                      <a:fillRect/>
+                    </a:stretch>
+                  </pic:blipFill>
+                  <pic:spPr>
+                    <a:xfrm>
+                      <a:off x="0" y="0"/>
+                      <a:ext cx="5524500" cy="2476500"/>
+                    </a:xfrm>
+                    <a:prstGeom prst="rect">
+                      <a:avLst/>
+                    </a:prstGeom>
+                  </pic:spPr>
+                </pic:pic>
+              </a:graphicData>
+            </a:graphic>
+          </wp:inline>
+        </w:drawing>
+      </w:r>
+    </w:p>
+    <w:p>
+      <w:r>
+        <w:rPr>
+          <w:b w:val="on"/>
+        </w:rPr>
+        <w:t xml:space="preserve"> Step12:RunningCM-ECCHKbatch</w:t>
+        <w:br/>
+        <w:drawing>
+          <wp:inline distT="0" distR="0" distB="0" distL="0">
+            <wp:extent cx="5524500" cy="2476500"/>
+            <wp:docPr id="30" name="Drawing 30" descr="Step12:RunningCM-ECCHKbatch"/>
+            <a:graphic xmlns:a="http://schemas.openxmlformats.org/drawingml/2006/main">
+              <a:graphicData uri="http://schemas.openxmlformats.org/drawingml/2006/picture">
+                <pic:pic xmlns:pic="http://schemas.openxmlformats.org/drawingml/2006/picture">
+                  <pic:nvPicPr>
+                    <pic:cNvPr id="0" name="Picture 30" descr="Step12:RunningCM-ECCHKbatch"/>
+                    <pic:cNvPicPr>
+                      <a:picLocks noChangeAspect="true"/>
+                    </pic:cNvPicPr>
+                  </pic:nvPicPr>
+                  <pic:blipFill>
+                    <a:blip r:embed="rId32"/>
+                    <a:stretch>
+                      <a:fillRect/>
+                    </a:stretch>
+                  </pic:blipFill>
+                  <pic:spPr>
+                    <a:xfrm>
+                      <a:off x="0" y="0"/>
+                      <a:ext cx="5524500" cy="2476500"/>
+                    </a:xfrm>
+                    <a:prstGeom prst="rect">
+                      <a:avLst/>
+                    </a:prstGeom>
+                  </pic:spPr>
+                </pic:pic>
+              </a:graphicData>
+            </a:graphic>
+          </wp:inline>
+        </w:drawing>
+      </w:r>
+    </w:p>
+    <w:p>
+      <w:r>
+        <w:rPr>
+          <w:b w:val="on"/>
+        </w:rPr>
+        <w:t xml:space="preserve"> Step12:Running Ecoes batch</w:t>
+        <w:br/>
+        <w:drawing>
+          <wp:inline distT="0" distR="0" distB="0" distL="0">
+            <wp:extent cx="5524500" cy="2476500"/>
+            <wp:docPr id="31" name="Drawing 31" descr="Step12:Running Ecoes batch"/>
+            <a:graphic xmlns:a="http://schemas.openxmlformats.org/drawingml/2006/main">
+              <a:graphicData uri="http://schemas.openxmlformats.org/drawingml/2006/picture">
+                <pic:pic xmlns:pic="http://schemas.openxmlformats.org/drawingml/2006/picture">
+                  <pic:nvPicPr>
+                    <pic:cNvPr id="0" name="Picture 31" descr="Step12:Running Ecoes batch"/>
+                    <pic:cNvPicPr>
+                      <a:picLocks noChangeAspect="true"/>
+                    </pic:cNvPicPr>
+                  </pic:nvPicPr>
+                  <pic:blipFill>
+                    <a:blip r:embed="rId33"/>
+                    <a:stretch>
+                      <a:fillRect/>
+                    </a:stretch>
+                  </pic:blipFill>
+                  <pic:spPr>
+                    <a:xfrm>
+                      <a:off x="0" y="0"/>
+                      <a:ext cx="5524500" cy="2476500"/>
+                    </a:xfrm>
+                    <a:prstGeom prst="rect">
+                      <a:avLst/>
+                    </a:prstGeom>
+                  </pic:spPr>
+                </pic:pic>
+              </a:graphicData>
+            </a:graphic>
+          </wp:inline>
+        </w:drawing>
+      </w:r>
+    </w:p>
+    <w:p>
+      <w:r>
+        <w:rPr>
+          <w:b w:val="on"/>
+        </w:rPr>
+        <w:t xml:space="preserve"> Step12:RunningCM-ECCHKbatch</w:t>
+        <w:br/>
+        <w:drawing>
+          <wp:inline distT="0" distR="0" distB="0" distL="0">
+            <wp:extent cx="5524500" cy="2476500"/>
+            <wp:docPr id="32" name="Drawing 32" descr="Step12:RunningCM-ECCHKbatch"/>
+            <a:graphic xmlns:a="http://schemas.openxmlformats.org/drawingml/2006/main">
+              <a:graphicData uri="http://schemas.openxmlformats.org/drawingml/2006/picture">
+                <pic:pic xmlns:pic="http://schemas.openxmlformats.org/drawingml/2006/picture">
+                  <pic:nvPicPr>
+                    <pic:cNvPr id="0" name="Picture 32" descr="Step12:RunningCM-ECCHKbatch"/>
+                    <pic:cNvPicPr>
+                      <a:picLocks noChangeAspect="true"/>
+                    </pic:cNvPicPr>
+                  </pic:nvPicPr>
+                  <pic:blipFill>
+                    <a:blip r:embed="rId34"/>
+                    <a:stretch>
+                      <a:fillRect/>
+                    </a:stretch>
+                  </pic:blipFill>
+                  <pic:spPr>
+                    <a:xfrm>
+                      <a:off x="0" y="0"/>
+                      <a:ext cx="5524500" cy="2476500"/>
+                    </a:xfrm>
+                    <a:prstGeom prst="rect">
+                      <a:avLst/>
+                    </a:prstGeom>
+                  </pic:spPr>
+                </pic:pic>
+              </a:graphicData>
+            </a:graphic>
+          </wp:inline>
+        </w:drawing>
+      </w:r>
+    </w:p>
+    <w:p>
+      <w:r>
+        <w:rPr>
+          <w:b w:val="on"/>
+        </w:rPr>
+        <w:t xml:space="preserve"> Step12:Running Ecoes batch</w:t>
+        <w:br/>
+        <w:drawing>
+          <wp:inline distT="0" distR="0" distB="0" distL="0">
+            <wp:extent cx="5524500" cy="2476500"/>
+            <wp:docPr id="33" name="Drawing 33" descr="Step12:Running Ecoes batch"/>
+            <a:graphic xmlns:a="http://schemas.openxmlformats.org/drawingml/2006/main">
+              <a:graphicData uri="http://schemas.openxmlformats.org/drawingml/2006/picture">
+                <pic:pic xmlns:pic="http://schemas.openxmlformats.org/drawingml/2006/picture">
+                  <pic:nvPicPr>
+                    <pic:cNvPr id="0" name="Picture 33" descr="Step12:Running Ecoes batch"/>
+                    <pic:cNvPicPr>
+                      <a:picLocks noChangeAspect="true"/>
+                    </pic:cNvPicPr>
+                  </pic:nvPicPr>
+                  <pic:blipFill>
+                    <a:blip r:embed="rId35"/>
+                    <a:stretch>
+                      <a:fillRect/>
+                    </a:stretch>
+                  </pic:blipFill>
+                  <pic:spPr>
+                    <a:xfrm>
+                      <a:off x="0" y="0"/>
+                      <a:ext cx="5524500" cy="2476500"/>
+                    </a:xfrm>
+                    <a:prstGeom prst="rect">
+                      <a:avLst/>
+                    </a:prstGeom>
+                  </pic:spPr>
+                </pic:pic>
+              </a:graphicData>
+            </a:graphic>
+          </wp:inline>
+        </w:drawing>
+      </w:r>
+    </w:p>
+    <w:p>
+      <w:r>
+        <w:rPr>
+          <w:b w:val="on"/>
+        </w:rPr>
+        <w:t xml:space="preserve"> Step12:RunningCM-ECCHKbatch</w:t>
+        <w:br/>
+        <w:drawing>
+          <wp:inline distT="0" distR="0" distB="0" distL="0">
+            <wp:extent cx="5524500" cy="2476500"/>
+            <wp:docPr id="34" name="Drawing 34" descr="Step12:RunningCM-ECCHKbatch"/>
+            <a:graphic xmlns:a="http://schemas.openxmlformats.org/drawingml/2006/main">
+              <a:graphicData uri="http://schemas.openxmlformats.org/drawingml/2006/picture">
+                <pic:pic xmlns:pic="http://schemas.openxmlformats.org/drawingml/2006/picture">
+                  <pic:nvPicPr>
+                    <pic:cNvPr id="0" name="Picture 34" descr="Step12:RunningCM-ECCHKbatch"/>
+                    <pic:cNvPicPr>
+                      <a:picLocks noChangeAspect="true"/>
+                    </pic:cNvPicPr>
+                  </pic:nvPicPr>
+                  <pic:blipFill>
+                    <a:blip r:embed="rId36"/>
+                    <a:stretch>
+                      <a:fillRect/>
+                    </a:stretch>
+                  </pic:blipFill>
+                  <pic:spPr>
+                    <a:xfrm>
+                      <a:off x="0" y="0"/>
+                      <a:ext cx="5524500" cy="2476500"/>
+                    </a:xfrm>
+                    <a:prstGeom prst="rect">
+                      <a:avLst/>
+                    </a:prstGeom>
+                  </pic:spPr>
+                </pic:pic>
+              </a:graphicData>
+            </a:graphic>
+          </wp:inline>
+        </w:drawing>
+      </w:r>
+    </w:p>
+    <w:p>
+      <w:r>
+        <w:rPr>
+          <w:b w:val="on"/>
+        </w:rPr>
+        <w:t xml:space="preserve"> Step12:Running Ecoes batch</w:t>
+        <w:br/>
+        <w:drawing>
+          <wp:inline distT="0" distR="0" distB="0" distL="0">
+            <wp:extent cx="5524500" cy="2476500"/>
+            <wp:docPr id="35" name="Drawing 35" descr="Step12:Running Ecoes batch"/>
+            <a:graphic xmlns:a="http://schemas.openxmlformats.org/drawingml/2006/main">
+              <a:graphicData uri="http://schemas.openxmlformats.org/drawingml/2006/picture">
+                <pic:pic xmlns:pic="http://schemas.openxmlformats.org/drawingml/2006/picture">
+                  <pic:nvPicPr>
+                    <pic:cNvPr id="0" name="Picture 35" descr="Step12:Running Ecoes batch"/>
+                    <pic:cNvPicPr>
+                      <a:picLocks noChangeAspect="true"/>
+                    </pic:cNvPicPr>
+                  </pic:nvPicPr>
+                  <pic:blipFill>
+                    <a:blip r:embed="rId37"/>
+                    <a:stretch>
+                      <a:fillRect/>
+                    </a:stretch>
+                  </pic:blipFill>
+                  <pic:spPr>
+                    <a:xfrm>
+                      <a:off x="0" y="0"/>
+                      <a:ext cx="5524500" cy="2476500"/>
+                    </a:xfrm>
+                    <a:prstGeom prst="rect">
+                      <a:avLst/>
+                    </a:prstGeom>
+                  </pic:spPr>
+                </pic:pic>
+              </a:graphicData>
+            </a:graphic>
+          </wp:inline>
+        </w:drawing>
+      </w:r>
+    </w:p>
+    <w:p>
+      <w:r>
+        <w:rPr>
+          <w:b w:val="on"/>
+        </w:rPr>
+        <w:t xml:space="preserve"> Step12:RunningCM-ECCHKbatch</w:t>
+        <w:br/>
+        <w:drawing>
+          <wp:inline distT="0" distR="0" distB="0" distL="0">
+            <wp:extent cx="5524500" cy="2476500"/>
+            <wp:docPr id="36" name="Drawing 36" descr="Step12:RunningCM-ECCHKbatch"/>
+            <a:graphic xmlns:a="http://schemas.openxmlformats.org/drawingml/2006/main">
+              <a:graphicData uri="http://schemas.openxmlformats.org/drawingml/2006/picture">
+                <pic:pic xmlns:pic="http://schemas.openxmlformats.org/drawingml/2006/picture">
+                  <pic:nvPicPr>
+                    <pic:cNvPr id="0" name="Picture 36" descr="Step12:RunningCM-ECCHKbatch"/>
+                    <pic:cNvPicPr>
+                      <a:picLocks noChangeAspect="true"/>
+                    </pic:cNvPicPr>
+                  </pic:nvPicPr>
+                  <pic:blipFill>
+                    <a:blip r:embed="rId38"/>
+                    <a:stretch>
+                      <a:fillRect/>
+                    </a:stretch>
+                  </pic:blipFill>
+                  <pic:spPr>
+                    <a:xfrm>
+                      <a:off x="0" y="0"/>
+                      <a:ext cx="5524500" cy="2476500"/>
+                    </a:xfrm>
+                    <a:prstGeom prst="rect">
+                      <a:avLst/>
+                    </a:prstGeom>
+                  </pic:spPr>
+                </pic:pic>
+              </a:graphicData>
+            </a:graphic>
+          </wp:inline>
+        </w:drawing>
+      </w:r>
+    </w:p>
+    <w:p>
+      <w:r>
+        <w:rPr>
+          <w:b w:val="on"/>
+        </w:rPr>
+        <w:t xml:space="preserve"> Step12:Running Ecoes batch</w:t>
+        <w:br/>
+        <w:drawing>
+          <wp:inline distT="0" distR="0" distB="0" distL="0">
+            <wp:extent cx="5524500" cy="2476500"/>
+            <wp:docPr id="37" name="Drawing 37" descr="Step12:Running Ecoes batch"/>
+            <a:graphic xmlns:a="http://schemas.openxmlformats.org/drawingml/2006/main">
+              <a:graphicData uri="http://schemas.openxmlformats.org/drawingml/2006/picture">
+                <pic:pic xmlns:pic="http://schemas.openxmlformats.org/drawingml/2006/picture">
+                  <pic:nvPicPr>
+                    <pic:cNvPr id="0" name="Picture 37" descr="Step12:Running Ecoes batch"/>
+                    <pic:cNvPicPr>
+                      <a:picLocks noChangeAspect="true"/>
+                    </pic:cNvPicPr>
+                  </pic:nvPicPr>
+                  <pic:blipFill>
+                    <a:blip r:embed="rId39"/>
+                    <a:stretch>
+                      <a:fillRect/>
+                    </a:stretch>
+                  </pic:blipFill>
+                  <pic:spPr>
+                    <a:xfrm>
+                      <a:off x="0" y="0"/>
+                      <a:ext cx="5524500" cy="2476500"/>
+                    </a:xfrm>
+                    <a:prstGeom prst="rect">
+                      <a:avLst/>
+                    </a:prstGeom>
+                  </pic:spPr>
+                </pic:pic>
+              </a:graphicData>
+            </a:graphic>
+          </wp:inline>
+        </w:drawing>
+      </w:r>
+    </w:p>
+    <w:p>
+      <w:r>
+        <w:rPr>
+          <w:b w:val="on"/>
+        </w:rPr>
+        <w:t xml:space="preserve"> Step12:RunningCM-ECCHKbatch</w:t>
+        <w:br/>
+        <w:drawing>
+          <wp:inline distT="0" distR="0" distB="0" distL="0">
+            <wp:extent cx="5524500" cy="2476500"/>
+            <wp:docPr id="38" name="Drawing 38" descr="Step12:RunningCM-ECCHKbatch"/>
+            <a:graphic xmlns:a="http://schemas.openxmlformats.org/drawingml/2006/main">
+              <a:graphicData uri="http://schemas.openxmlformats.org/drawingml/2006/picture">
+                <pic:pic xmlns:pic="http://schemas.openxmlformats.org/drawingml/2006/picture">
+                  <pic:nvPicPr>
+                    <pic:cNvPr id="0" name="Picture 38" descr="Step12:RunningCM-ECCHKbatch"/>
+                    <pic:cNvPicPr>
+                      <a:picLocks noChangeAspect="true"/>
+                    </pic:cNvPicPr>
+                  </pic:nvPicPr>
+                  <pic:blipFill>
+                    <a:blip r:embed="rId40"/>
+                    <a:stretch>
+                      <a:fillRect/>
+                    </a:stretch>
+                  </pic:blipFill>
+                  <pic:spPr>
+                    <a:xfrm>
+                      <a:off x="0" y="0"/>
+                      <a:ext cx="5524500" cy="2476500"/>
+                    </a:xfrm>
+                    <a:prstGeom prst="rect">
+                      <a:avLst/>
+                    </a:prstGeom>
+                  </pic:spPr>
+                </pic:pic>
+              </a:graphicData>
+            </a:graphic>
+          </wp:inline>
+        </w:drawing>
+      </w:r>
+    </w:p>
+    <w:p>
+      <w:r>
+        <w:rPr>
+          <w:b w:val="on"/>
+        </w:rPr>
+        <w:t xml:space="preserve"> Step12:Running Ecoes batch</w:t>
+        <w:br/>
+        <w:drawing>
+          <wp:inline distT="0" distR="0" distB="0" distL="0">
+            <wp:extent cx="5524500" cy="2476500"/>
+            <wp:docPr id="39" name="Drawing 39" descr="Step12:Running Ecoes batch"/>
+            <a:graphic xmlns:a="http://schemas.openxmlformats.org/drawingml/2006/main">
+              <a:graphicData uri="http://schemas.openxmlformats.org/drawingml/2006/picture">
+                <pic:pic xmlns:pic="http://schemas.openxmlformats.org/drawingml/2006/picture">
+                  <pic:nvPicPr>
+                    <pic:cNvPr id="0" name="Picture 39" descr="Step12:Running Ecoes batch"/>
+                    <pic:cNvPicPr>
+                      <a:picLocks noChangeAspect="true"/>
+                    </pic:cNvPicPr>
+                  </pic:nvPicPr>
+                  <pic:blipFill>
+                    <a:blip r:embed="rId41"/>
+                    <a:stretch>
+                      <a:fillRect/>
+                    </a:stretch>
+                  </pic:blipFill>
+                  <pic:spPr>
+                    <a:xfrm>
+                      <a:off x="0" y="0"/>
+                      <a:ext cx="5524500" cy="2476500"/>
+                    </a:xfrm>
+                    <a:prstGeom prst="rect">
+                      <a:avLst/>
+                    </a:prstGeom>
+                  </pic:spPr>
+                </pic:pic>
+              </a:graphicData>
+            </a:graphic>
+          </wp:inline>
+        </w:drawing>
+      </w:r>
+    </w:p>
+    <w:p>
+      <w:r>
+        <w:rPr>
+          <w:b w:val="on"/>
+        </w:rPr>
+        <w:t xml:space="preserve"> Step12:RunningCM-ECCHKbatch</w:t>
+        <w:br/>
+        <w:drawing>
+          <wp:inline distT="0" distR="0" distB="0" distL="0">
+            <wp:extent cx="5524500" cy="2476500"/>
+            <wp:docPr id="40" name="Drawing 40" descr="Step12:RunningCM-ECCHKbatch"/>
+            <a:graphic xmlns:a="http://schemas.openxmlformats.org/drawingml/2006/main">
+              <a:graphicData uri="http://schemas.openxmlformats.org/drawingml/2006/picture">
+                <pic:pic xmlns:pic="http://schemas.openxmlformats.org/drawingml/2006/picture">
+                  <pic:nvPicPr>
+                    <pic:cNvPr id="0" name="Picture 40" descr="Step12:RunningCM-ECCHKbatch"/>
+                    <pic:cNvPicPr>
+                      <a:picLocks noChangeAspect="true"/>
+                    </pic:cNvPicPr>
+                  </pic:nvPicPr>
+                  <pic:blipFill>
+                    <a:blip r:embed="rId42"/>
+                    <a:stretch>
+                      <a:fillRect/>
+                    </a:stretch>
+                  </pic:blipFill>
+                  <pic:spPr>
+                    <a:xfrm>
+                      <a:off x="0" y="0"/>
+                      <a:ext cx="5524500" cy="2476500"/>
+                    </a:xfrm>
+                    <a:prstGeom prst="rect">
+                      <a:avLst/>
+                    </a:prstGeom>
+                  </pic:spPr>
+                </pic:pic>
+              </a:graphicData>
+            </a:graphic>
+          </wp:inline>
+        </w:drawing>
+      </w:r>
+    </w:p>
+    <w:p>
+      <w:r>
+        <w:rPr>
+          <w:b w:val="on"/>
+        </w:rPr>
+        <w:t xml:space="preserve"> Step12:Running Ecoes batch</w:t>
+        <w:br/>
+        <w:drawing>
+          <wp:inline distT="0" distR="0" distB="0" distL="0">
+            <wp:extent cx="5524500" cy="2476500"/>
+            <wp:docPr id="41" name="Drawing 41" descr="Step12:Running Ecoes batch"/>
+            <a:graphic xmlns:a="http://schemas.openxmlformats.org/drawingml/2006/main">
+              <a:graphicData uri="http://schemas.openxmlformats.org/drawingml/2006/picture">
+                <pic:pic xmlns:pic="http://schemas.openxmlformats.org/drawingml/2006/picture">
+                  <pic:nvPicPr>
+                    <pic:cNvPr id="0" name="Picture 41" descr="Step12:Running Ecoes batch"/>
+                    <pic:cNvPicPr>
+                      <a:picLocks noChangeAspect="true"/>
+                    </pic:cNvPicPr>
+                  </pic:nvPicPr>
+                  <pic:blipFill>
+                    <a:blip r:embed="rId43"/>
+                    <a:stretch>
+                      <a:fillRect/>
+                    </a:stretch>
+                  </pic:blipFill>
+                  <pic:spPr>
+                    <a:xfrm>
+                      <a:off x="0" y="0"/>
+                      <a:ext cx="5524500" cy="2476500"/>
+                    </a:xfrm>
+                    <a:prstGeom prst="rect">
+                      <a:avLst/>
+                    </a:prstGeom>
+                  </pic:spPr>
+                </pic:pic>
+              </a:graphicData>
+            </a:graphic>
+          </wp:inline>
+        </w:drawing>
+      </w:r>
+    </w:p>
+    <w:p>
+      <w:r>
+        <w:rPr>
+          <w:b w:val="on"/>
+        </w:rPr>
+        <w:t xml:space="preserve"> Step12:RunningCM-ECCHKbatch</w:t>
+        <w:br/>
+        <w:drawing>
+          <wp:inline distT="0" distR="0" distB="0" distL="0">
+            <wp:extent cx="5524500" cy="2476500"/>
+            <wp:docPr id="42" name="Drawing 42" descr="Step12:RunningCM-ECCHKbatch"/>
+            <a:graphic xmlns:a="http://schemas.openxmlformats.org/drawingml/2006/main">
+              <a:graphicData uri="http://schemas.openxmlformats.org/drawingml/2006/picture">
+                <pic:pic xmlns:pic="http://schemas.openxmlformats.org/drawingml/2006/picture">
+                  <pic:nvPicPr>
+                    <pic:cNvPr id="0" name="Picture 42" descr="Step12:RunningCM-ECCHKbatch"/>
+                    <pic:cNvPicPr>
+                      <a:picLocks noChangeAspect="true"/>
+                    </pic:cNvPicPr>
+                  </pic:nvPicPr>
+                  <pic:blipFill>
+                    <a:blip r:embed="rId44"/>
+                    <a:stretch>
+                      <a:fillRect/>
+                    </a:stretch>
+                  </pic:blipFill>
+                  <pic:spPr>
+                    <a:xfrm>
+                      <a:off x="0" y="0"/>
+                      <a:ext cx="5524500" cy="2476500"/>
+                    </a:xfrm>
+                    <a:prstGeom prst="rect">
+                      <a:avLst/>
+                    </a:prstGeom>
+                  </pic:spPr>
+                </pic:pic>
+              </a:graphicData>
+            </a:graphic>
+          </wp:inline>
+        </w:drawing>
+      </w:r>
+    </w:p>
+    <w:p>
+      <w:r>
+        <w:rPr>
+          <w:b w:val="on"/>
+        </w:rPr>
+        <w:t xml:space="preserve"> Step12:Running Ecoes batch</w:t>
+        <w:br/>
+        <w:drawing>
+          <wp:inline distT="0" distR="0" distB="0" distL="0">
+            <wp:extent cx="5524500" cy="2476500"/>
+            <wp:docPr id="43" name="Drawing 43" descr="Step12:Running Ecoes batch"/>
+            <a:graphic xmlns:a="http://schemas.openxmlformats.org/drawingml/2006/main">
+              <a:graphicData uri="http://schemas.openxmlformats.org/drawingml/2006/picture">
+                <pic:pic xmlns:pic="http://schemas.openxmlformats.org/drawingml/2006/picture">
+                  <pic:nvPicPr>
+                    <pic:cNvPr id="0" name="Picture 43" descr="Step12:Running Ecoes batch"/>
+                    <pic:cNvPicPr>
+                      <a:picLocks noChangeAspect="true"/>
+                    </pic:cNvPicPr>
+                  </pic:nvPicPr>
+                  <pic:blipFill>
+                    <a:blip r:embed="rId45"/>
+                    <a:stretch>
+                      <a:fillRect/>
+                    </a:stretch>
+                  </pic:blipFill>
+                  <pic:spPr>
+                    <a:xfrm>
+                      <a:off x="0" y="0"/>
+                      <a:ext cx="5524500" cy="2476500"/>
+                    </a:xfrm>
+                    <a:prstGeom prst="rect">
+                      <a:avLst/>
+                    </a:prstGeom>
+                  </pic:spPr>
+                </pic:pic>
+              </a:graphicData>
+            </a:graphic>
+          </wp:inline>
+        </w:drawing>
+      </w:r>
+    </w:p>
+    <w:p>
+      <w:r>
+        <w:rPr>
+          <w:b w:val="on"/>
+        </w:rPr>
+        <w:t xml:space="preserve"> Step12:RunningCM-ECCHKbatch</w:t>
+        <w:br/>
+        <w:drawing>
+          <wp:inline distT="0" distR="0" distB="0" distL="0">
+            <wp:extent cx="5524500" cy="2476500"/>
+            <wp:docPr id="44" name="Drawing 44" descr="Step12:RunningCM-ECCHKbatch"/>
+            <a:graphic xmlns:a="http://schemas.openxmlformats.org/drawingml/2006/main">
+              <a:graphicData uri="http://schemas.openxmlformats.org/drawingml/2006/picture">
+                <pic:pic xmlns:pic="http://schemas.openxmlformats.org/drawingml/2006/picture">
+                  <pic:nvPicPr>
+                    <pic:cNvPr id="0" name="Picture 44" descr="Step12:RunningCM-ECCHKbatch"/>
+                    <pic:cNvPicPr>
+                      <a:picLocks noChangeAspect="true"/>
+                    </pic:cNvPicPr>
+                  </pic:nvPicPr>
+                  <pic:blipFill>
+                    <a:blip r:embed="rId46"/>
+                    <a:stretch>
+                      <a:fillRect/>
+                    </a:stretch>
+                  </pic:blipFill>
+                  <pic:spPr>
+                    <a:xfrm>
+                      <a:off x="0" y="0"/>
+                      <a:ext cx="5524500" cy="2476500"/>
+                    </a:xfrm>
+                    <a:prstGeom prst="rect">
+                      <a:avLst/>
+                    </a:prstGeom>
+                  </pic:spPr>
+                </pic:pic>
+              </a:graphicData>
+            </a:graphic>
+          </wp:inline>
+        </w:drawing>
+      </w:r>
+    </w:p>
+    <w:p>
+      <w:r>
+        <w:rPr>
+          <w:b w:val="on"/>
+        </w:rPr>
+        <w:t xml:space="preserve"> Step12:Running Ecoes batch</w:t>
+        <w:br/>
+        <w:drawing>
+          <wp:inline distT="0" distR="0" distB="0" distL="0">
+            <wp:extent cx="5524500" cy="2476500"/>
+            <wp:docPr id="45" name="Drawing 45" descr="Step12:Running Ecoes batch"/>
+            <a:graphic xmlns:a="http://schemas.openxmlformats.org/drawingml/2006/main">
+              <a:graphicData uri="http://schemas.openxmlformats.org/drawingml/2006/picture">
+                <pic:pic xmlns:pic="http://schemas.openxmlformats.org/drawingml/2006/picture">
+                  <pic:nvPicPr>
+                    <pic:cNvPr id="0" name="Picture 45" descr="Step12:Running Ecoes batch"/>
+                    <pic:cNvPicPr>
+                      <a:picLocks noChangeAspect="true"/>
+                    </pic:cNvPicPr>
+                  </pic:nvPicPr>
+                  <pic:blipFill>
+                    <a:blip r:embed="rId47"/>
+                    <a:stretch>
+                      <a:fillRect/>
+                    </a:stretch>
+                  </pic:blipFill>
+                  <pic:spPr>
+                    <a:xfrm>
+                      <a:off x="0" y="0"/>
+                      <a:ext cx="5524500" cy="2476500"/>
+                    </a:xfrm>
+                    <a:prstGeom prst="rect">
+                      <a:avLst/>
+                    </a:prstGeom>
+                  </pic:spPr>
+                </pic:pic>
+              </a:graphicData>
+            </a:graphic>
+          </wp:inline>
+        </w:drawing>
+      </w:r>
+    </w:p>
+    <w:p>
+      <w:r>
+        <w:rPr>
+          <w:b w:val="on"/>
+        </w:rPr>
+        <w:t xml:space="preserve"> Step12:RunningCM-ECCHKbatch</w:t>
+        <w:br/>
+        <w:drawing>
+          <wp:inline distT="0" distR="0" distB="0" distL="0">
+            <wp:extent cx="5524500" cy="2476500"/>
+            <wp:docPr id="46" name="Drawing 46" descr="Step12:RunningCM-ECCHKbatch"/>
+            <a:graphic xmlns:a="http://schemas.openxmlformats.org/drawingml/2006/main">
+              <a:graphicData uri="http://schemas.openxmlformats.org/drawingml/2006/picture">
+                <pic:pic xmlns:pic="http://schemas.openxmlformats.org/drawingml/2006/picture">
+                  <pic:nvPicPr>
+                    <pic:cNvPr id="0" name="Picture 46" descr="Step12:RunningCM-ECCHKbatch"/>
+                    <pic:cNvPicPr>
+                      <a:picLocks noChangeAspect="true"/>
+                    </pic:cNvPicPr>
+                  </pic:nvPicPr>
+                  <pic:blipFill>
+                    <a:blip r:embed="rId48"/>
+                    <a:stretch>
+                      <a:fillRect/>
+                    </a:stretch>
+                  </pic:blipFill>
+                  <pic:spPr>
+                    <a:xfrm>
+                      <a:off x="0" y="0"/>
+                      <a:ext cx="5524500" cy="2476500"/>
+                    </a:xfrm>
+                    <a:prstGeom prst="rect">
+                      <a:avLst/>
+                    </a:prstGeom>
+                  </pic:spPr>
+                </pic:pic>
+              </a:graphicData>
+            </a:graphic>
+          </wp:inline>
+        </w:drawing>
+      </w:r>
+    </w:p>
+    <w:p>
+      <w:r>
+        <w:rPr>
+          <w:b w:val="on"/>
+        </w:rPr>
+        <w:t xml:space="preserve"> Step12:Running Ecoes batch</w:t>
+        <w:br/>
+        <w:drawing>
+          <wp:inline distT="0" distR="0" distB="0" distL="0">
+            <wp:extent cx="5524500" cy="2476500"/>
+            <wp:docPr id="47" name="Drawing 47" descr="Step12:Running Ecoes batch"/>
+            <a:graphic xmlns:a="http://schemas.openxmlformats.org/drawingml/2006/main">
+              <a:graphicData uri="http://schemas.openxmlformats.org/drawingml/2006/picture">
+                <pic:pic xmlns:pic="http://schemas.openxmlformats.org/drawingml/2006/picture">
+                  <pic:nvPicPr>
+                    <pic:cNvPr id="0" name="Picture 47" descr="Step12:Running Ecoes batch"/>
+                    <pic:cNvPicPr>
+                      <a:picLocks noChangeAspect="true"/>
+                    </pic:cNvPicPr>
+                  </pic:nvPicPr>
+                  <pic:blipFill>
+                    <a:blip r:embed="rId49"/>
+                    <a:stretch>
+                      <a:fillRect/>
+                    </a:stretch>
+                  </pic:blipFill>
+                  <pic:spPr>
+                    <a:xfrm>
+                      <a:off x="0" y="0"/>
+                      <a:ext cx="5524500" cy="2476500"/>
+                    </a:xfrm>
+                    <a:prstGeom prst="rect">
+                      <a:avLst/>
+                    </a:prstGeom>
+                  </pic:spPr>
+                </pic:pic>
+              </a:graphicData>
+            </a:graphic>
+          </wp:inline>
+        </w:drawing>
+      </w:r>
+    </w:p>
+    <w:p>
+      <w:r>
+        <w:rPr>
+          <w:b w:val="on"/>
+        </w:rPr>
+        <w:t xml:space="preserve"> Step12:RunningCM-ECCHKbatch</w:t>
+        <w:br/>
+        <w:drawing>
+          <wp:inline distT="0" distR="0" distB="0" distL="0">
+            <wp:extent cx="5524500" cy="2476500"/>
+            <wp:docPr id="48" name="Drawing 48" descr="Step12:RunningCM-ECCHKbatch"/>
+            <a:graphic xmlns:a="http://schemas.openxmlformats.org/drawingml/2006/main">
+              <a:graphicData uri="http://schemas.openxmlformats.org/drawingml/2006/picture">
+                <pic:pic xmlns:pic="http://schemas.openxmlformats.org/drawingml/2006/picture">
+                  <pic:nvPicPr>
+                    <pic:cNvPr id="0" name="Picture 48" descr="Step12:RunningCM-ECCHKbatch"/>
+                    <pic:cNvPicPr>
+                      <a:picLocks noChangeAspect="true"/>
+                    </pic:cNvPicPr>
+                  </pic:nvPicPr>
+                  <pic:blipFill>
+                    <a:blip r:embed="rId50"/>
+                    <a:stretch>
+                      <a:fillRect/>
+                    </a:stretch>
+                  </pic:blipFill>
+                  <pic:spPr>
+                    <a:xfrm>
+                      <a:off x="0" y="0"/>
+                      <a:ext cx="5524500" cy="2476500"/>
+                    </a:xfrm>
+                    <a:prstGeom prst="rect">
+                      <a:avLst/>
+                    </a:prstGeom>
+                  </pic:spPr>
+                </pic:pic>
+              </a:graphicData>
+            </a:graphic>
+          </wp:inline>
+        </w:drawing>
+      </w:r>
+    </w:p>
+    <w:p>
+      <w:r>
+        <w:rPr>
+          <w:b w:val="on"/>
+        </w:rPr>
+        <w:t xml:space="preserve"> Step12:Running Ecoes batch</w:t>
+        <w:br/>
+        <w:drawing>
+          <wp:inline distT="0" distR="0" distB="0" distL="0">
+            <wp:extent cx="5524500" cy="2476500"/>
+            <wp:docPr id="49" name="Drawing 49" descr="Step12:Running Ecoes batch"/>
+            <a:graphic xmlns:a="http://schemas.openxmlformats.org/drawingml/2006/main">
+              <a:graphicData uri="http://schemas.openxmlformats.org/drawingml/2006/picture">
+                <pic:pic xmlns:pic="http://schemas.openxmlformats.org/drawingml/2006/picture">
+                  <pic:nvPicPr>
+                    <pic:cNvPr id="0" name="Picture 49" descr="Step12:Running Ecoes batch"/>
+                    <pic:cNvPicPr>
+                      <a:picLocks noChangeAspect="true"/>
+                    </pic:cNvPicPr>
+                  </pic:nvPicPr>
+                  <pic:blipFill>
+                    <a:blip r:embed="rId51"/>
+                    <a:stretch>
+                      <a:fillRect/>
+                    </a:stretch>
+                  </pic:blipFill>
+                  <pic:spPr>
+                    <a:xfrm>
+                      <a:off x="0" y="0"/>
+                      <a:ext cx="5524500" cy="2476500"/>
+                    </a:xfrm>
+                    <a:prstGeom prst="rect">
+                      <a:avLst/>
+                    </a:prstGeom>
+                  </pic:spPr>
+                </pic:pic>
+              </a:graphicData>
+            </a:graphic>
+          </wp:inline>
+        </w:drawing>
+      </w:r>
+    </w:p>
   </w:body>
 </w:document>
 </file>
</xml_diff>

<commit_message>
updated with entity creation
</commit_message>
<xml_diff>
--- a/COMC15P1.docx
+++ b/COMC15P1.docx
@@ -2102,6 +2102,384 @@
         </w:drawing>
       </w:r>
     </w:p>
+    <w:p>
+      <w:r>
+        <w:rPr>
+          <w:b w:val="on"/>
+        </w:rPr>
+        <w:t xml:space="preserve"> Step12:RunningCM-ECCHKbatch</w:t>
+        <w:br/>
+        <w:drawing>
+          <wp:inline distT="0" distR="0" distB="0" distL="0">
+            <wp:extent cx="5524500" cy="2476500"/>
+            <wp:docPr id="50" name="Drawing 50" descr="Step12:RunningCM-ECCHKbatch"/>
+            <a:graphic xmlns:a="http://schemas.openxmlformats.org/drawingml/2006/main">
+              <a:graphicData uri="http://schemas.openxmlformats.org/drawingml/2006/picture">
+                <pic:pic xmlns:pic="http://schemas.openxmlformats.org/drawingml/2006/picture">
+                  <pic:nvPicPr>
+                    <pic:cNvPr id="0" name="Picture 50" descr="Step12:RunningCM-ECCHKbatch"/>
+                    <pic:cNvPicPr>
+                      <a:picLocks noChangeAspect="true"/>
+                    </pic:cNvPicPr>
+                  </pic:nvPicPr>
+                  <pic:blipFill>
+                    <a:blip r:embed="rId52"/>
+                    <a:stretch>
+                      <a:fillRect/>
+                    </a:stretch>
+                  </pic:blipFill>
+                  <pic:spPr>
+                    <a:xfrm>
+                      <a:off x="0" y="0"/>
+                      <a:ext cx="5524500" cy="2476500"/>
+                    </a:xfrm>
+                    <a:prstGeom prst="rect">
+                      <a:avLst/>
+                    </a:prstGeom>
+                  </pic:spPr>
+                </pic:pic>
+              </a:graphicData>
+            </a:graphic>
+          </wp:inline>
+        </w:drawing>
+      </w:r>
+    </w:p>
+    <w:p>
+      <w:r>
+        <w:rPr>
+          <w:b w:val="on"/>
+        </w:rPr>
+        <w:t xml:space="preserve"> Step12:Running Ecoes batch</w:t>
+        <w:br/>
+        <w:drawing>
+          <wp:inline distT="0" distR="0" distB="0" distL="0">
+            <wp:extent cx="5524500" cy="2476500"/>
+            <wp:docPr id="51" name="Drawing 51" descr="Step12:Running Ecoes batch"/>
+            <a:graphic xmlns:a="http://schemas.openxmlformats.org/drawingml/2006/main">
+              <a:graphicData uri="http://schemas.openxmlformats.org/drawingml/2006/picture">
+                <pic:pic xmlns:pic="http://schemas.openxmlformats.org/drawingml/2006/picture">
+                  <pic:nvPicPr>
+                    <pic:cNvPr id="0" name="Picture 51" descr="Step12:Running Ecoes batch"/>
+                    <pic:cNvPicPr>
+                      <a:picLocks noChangeAspect="true"/>
+                    </pic:cNvPicPr>
+                  </pic:nvPicPr>
+                  <pic:blipFill>
+                    <a:blip r:embed="rId53"/>
+                    <a:stretch>
+                      <a:fillRect/>
+                    </a:stretch>
+                  </pic:blipFill>
+                  <pic:spPr>
+                    <a:xfrm>
+                      <a:off x="0" y="0"/>
+                      <a:ext cx="5524500" cy="2476500"/>
+                    </a:xfrm>
+                    <a:prstGeom prst="rect">
+                      <a:avLst/>
+                    </a:prstGeom>
+                  </pic:spPr>
+                </pic:pic>
+              </a:graphicData>
+            </a:graphic>
+          </wp:inline>
+        </w:drawing>
+      </w:r>
+    </w:p>
+    <w:p>
+      <w:r>
+        <w:rPr>
+          <w:b w:val="on"/>
+        </w:rPr>
+        <w:t xml:space="preserve"> Step12:RunningCM-ECCHKbatch</w:t>
+        <w:br/>
+        <w:drawing>
+          <wp:inline distT="0" distR="0" distB="0" distL="0">
+            <wp:extent cx="5524500" cy="2476500"/>
+            <wp:docPr id="52" name="Drawing 52" descr="Step12:RunningCM-ECCHKbatch"/>
+            <a:graphic xmlns:a="http://schemas.openxmlformats.org/drawingml/2006/main">
+              <a:graphicData uri="http://schemas.openxmlformats.org/drawingml/2006/picture">
+                <pic:pic xmlns:pic="http://schemas.openxmlformats.org/drawingml/2006/picture">
+                  <pic:nvPicPr>
+                    <pic:cNvPr id="0" name="Picture 52" descr="Step12:RunningCM-ECCHKbatch"/>
+                    <pic:cNvPicPr>
+                      <a:picLocks noChangeAspect="true"/>
+                    </pic:cNvPicPr>
+                  </pic:nvPicPr>
+                  <pic:blipFill>
+                    <a:blip r:embed="rId54"/>
+                    <a:stretch>
+                      <a:fillRect/>
+                    </a:stretch>
+                  </pic:blipFill>
+                  <pic:spPr>
+                    <a:xfrm>
+                      <a:off x="0" y="0"/>
+                      <a:ext cx="5524500" cy="2476500"/>
+                    </a:xfrm>
+                    <a:prstGeom prst="rect">
+                      <a:avLst/>
+                    </a:prstGeom>
+                  </pic:spPr>
+                </pic:pic>
+              </a:graphicData>
+            </a:graphic>
+          </wp:inline>
+        </w:drawing>
+      </w:r>
+    </w:p>
+    <w:p>
+      <w:r>
+        <w:rPr>
+          <w:b w:val="on"/>
+        </w:rPr>
+        <w:t xml:space="preserve"> Step12:RunningCM-ECCHKbatch</w:t>
+        <w:br/>
+        <w:drawing>
+          <wp:inline distT="0" distR="0" distB="0" distL="0">
+            <wp:extent cx="5524500" cy="2476500"/>
+            <wp:docPr id="53" name="Drawing 53" descr="Step12:RunningCM-ECCHKbatch"/>
+            <a:graphic xmlns:a="http://schemas.openxmlformats.org/drawingml/2006/main">
+              <a:graphicData uri="http://schemas.openxmlformats.org/drawingml/2006/picture">
+                <pic:pic xmlns:pic="http://schemas.openxmlformats.org/drawingml/2006/picture">
+                  <pic:nvPicPr>
+                    <pic:cNvPr id="0" name="Picture 53" descr="Step12:RunningCM-ECCHKbatch"/>
+                    <pic:cNvPicPr>
+                      <a:picLocks noChangeAspect="true"/>
+                    </pic:cNvPicPr>
+                  </pic:nvPicPr>
+                  <pic:blipFill>
+                    <a:blip r:embed="rId55"/>
+                    <a:stretch>
+                      <a:fillRect/>
+                    </a:stretch>
+                  </pic:blipFill>
+                  <pic:spPr>
+                    <a:xfrm>
+                      <a:off x="0" y="0"/>
+                      <a:ext cx="5524500" cy="2476500"/>
+                    </a:xfrm>
+                    <a:prstGeom prst="rect">
+                      <a:avLst/>
+                    </a:prstGeom>
+                  </pic:spPr>
+                </pic:pic>
+              </a:graphicData>
+            </a:graphic>
+          </wp:inline>
+        </w:drawing>
+      </w:r>
+    </w:p>
+    <w:p>
+      <w:r>
+        <w:rPr>
+          <w:b w:val="on"/>
+        </w:rPr>
+        <w:t xml:space="preserve"> Step12:Running Ecoes batch</w:t>
+        <w:br/>
+        <w:drawing>
+          <wp:inline distT="0" distR="0" distB="0" distL="0">
+            <wp:extent cx="5524500" cy="2476500"/>
+            <wp:docPr id="54" name="Drawing 54" descr="Step12:Running Ecoes batch"/>
+            <a:graphic xmlns:a="http://schemas.openxmlformats.org/drawingml/2006/main">
+              <a:graphicData uri="http://schemas.openxmlformats.org/drawingml/2006/picture">
+                <pic:pic xmlns:pic="http://schemas.openxmlformats.org/drawingml/2006/picture">
+                  <pic:nvPicPr>
+                    <pic:cNvPr id="0" name="Picture 54" descr="Step12:Running Ecoes batch"/>
+                    <pic:cNvPicPr>
+                      <a:picLocks noChangeAspect="true"/>
+                    </pic:cNvPicPr>
+                  </pic:nvPicPr>
+                  <pic:blipFill>
+                    <a:blip r:embed="rId56"/>
+                    <a:stretch>
+                      <a:fillRect/>
+                    </a:stretch>
+                  </pic:blipFill>
+                  <pic:spPr>
+                    <a:xfrm>
+                      <a:off x="0" y="0"/>
+                      <a:ext cx="5524500" cy="2476500"/>
+                    </a:xfrm>
+                    <a:prstGeom prst="rect">
+                      <a:avLst/>
+                    </a:prstGeom>
+                  </pic:spPr>
+                </pic:pic>
+              </a:graphicData>
+            </a:graphic>
+          </wp:inline>
+        </w:drawing>
+      </w:r>
+    </w:p>
+    <w:p>
+      <w:r>
+        <w:rPr>
+          <w:b w:val="on"/>
+        </w:rPr>
+        <w:t xml:space="preserve"> Step12:RunningCM-ECCHKbatch</w:t>
+        <w:br/>
+        <w:drawing>
+          <wp:inline distT="0" distR="0" distB="0" distL="0">
+            <wp:extent cx="5524500" cy="2476500"/>
+            <wp:docPr id="55" name="Drawing 55" descr="Step12:RunningCM-ECCHKbatch"/>
+            <a:graphic xmlns:a="http://schemas.openxmlformats.org/drawingml/2006/main">
+              <a:graphicData uri="http://schemas.openxmlformats.org/drawingml/2006/picture">
+                <pic:pic xmlns:pic="http://schemas.openxmlformats.org/drawingml/2006/picture">
+                  <pic:nvPicPr>
+                    <pic:cNvPr id="0" name="Picture 55" descr="Step12:RunningCM-ECCHKbatch"/>
+                    <pic:cNvPicPr>
+                      <a:picLocks noChangeAspect="true"/>
+                    </pic:cNvPicPr>
+                  </pic:nvPicPr>
+                  <pic:blipFill>
+                    <a:blip r:embed="rId57"/>
+                    <a:stretch>
+                      <a:fillRect/>
+                    </a:stretch>
+                  </pic:blipFill>
+                  <pic:spPr>
+                    <a:xfrm>
+                      <a:off x="0" y="0"/>
+                      <a:ext cx="5524500" cy="2476500"/>
+                    </a:xfrm>
+                    <a:prstGeom prst="rect">
+                      <a:avLst/>
+                    </a:prstGeom>
+                  </pic:spPr>
+                </pic:pic>
+              </a:graphicData>
+            </a:graphic>
+          </wp:inline>
+        </w:drawing>
+      </w:r>
+    </w:p>
+    <w:p>
+      <w:r>
+        <w:rPr>
+          <w:b w:val="on"/>
+        </w:rPr>
+        <w:t xml:space="preserve"> Step12:Running Ecoes batch</w:t>
+        <w:br/>
+        <w:drawing>
+          <wp:inline distT="0" distR="0" distB="0" distL="0">
+            <wp:extent cx="5524500" cy="2476500"/>
+            <wp:docPr id="56" name="Drawing 56" descr="Step12:Running Ecoes batch"/>
+            <a:graphic xmlns:a="http://schemas.openxmlformats.org/drawingml/2006/main">
+              <a:graphicData uri="http://schemas.openxmlformats.org/drawingml/2006/picture">
+                <pic:pic xmlns:pic="http://schemas.openxmlformats.org/drawingml/2006/picture">
+                  <pic:nvPicPr>
+                    <pic:cNvPr id="0" name="Picture 56" descr="Step12:Running Ecoes batch"/>
+                    <pic:cNvPicPr>
+                      <a:picLocks noChangeAspect="true"/>
+                    </pic:cNvPicPr>
+                  </pic:nvPicPr>
+                  <pic:blipFill>
+                    <a:blip r:embed="rId58"/>
+                    <a:stretch>
+                      <a:fillRect/>
+                    </a:stretch>
+                  </pic:blipFill>
+                  <pic:spPr>
+                    <a:xfrm>
+                      <a:off x="0" y="0"/>
+                      <a:ext cx="5524500" cy="2476500"/>
+                    </a:xfrm>
+                    <a:prstGeom prst="rect">
+                      <a:avLst/>
+                    </a:prstGeom>
+                  </pic:spPr>
+                </pic:pic>
+              </a:graphicData>
+            </a:graphic>
+          </wp:inline>
+        </w:drawing>
+      </w:r>
+    </w:p>
+    <w:p>
+      <w:r>
+        <w:rPr>
+          <w:b w:val="on"/>
+        </w:rPr>
+        <w:t xml:space="preserve"> Step12:RunningCM-ECCHKbatch</w:t>
+        <w:br/>
+        <w:drawing>
+          <wp:inline distT="0" distR="0" distB="0" distL="0">
+            <wp:extent cx="5524500" cy="2476500"/>
+            <wp:docPr id="57" name="Drawing 57" descr="Step12:RunningCM-ECCHKbatch"/>
+            <a:graphic xmlns:a="http://schemas.openxmlformats.org/drawingml/2006/main">
+              <a:graphicData uri="http://schemas.openxmlformats.org/drawingml/2006/picture">
+                <pic:pic xmlns:pic="http://schemas.openxmlformats.org/drawingml/2006/picture">
+                  <pic:nvPicPr>
+                    <pic:cNvPr id="0" name="Picture 57" descr="Step12:RunningCM-ECCHKbatch"/>
+                    <pic:cNvPicPr>
+                      <a:picLocks noChangeAspect="true"/>
+                    </pic:cNvPicPr>
+                  </pic:nvPicPr>
+                  <pic:blipFill>
+                    <a:blip r:embed="rId59"/>
+                    <a:stretch>
+                      <a:fillRect/>
+                    </a:stretch>
+                  </pic:blipFill>
+                  <pic:spPr>
+                    <a:xfrm>
+                      <a:off x="0" y="0"/>
+                      <a:ext cx="5524500" cy="2476500"/>
+                    </a:xfrm>
+                    <a:prstGeom prst="rect">
+                      <a:avLst/>
+                    </a:prstGeom>
+                  </pic:spPr>
+                </pic:pic>
+              </a:graphicData>
+            </a:graphic>
+          </wp:inline>
+        </w:drawing>
+      </w:r>
+    </w:p>
+    <w:p>
+      <w:r>
+        <w:rPr>
+          <w:b w:val="on"/>
+        </w:rPr>
+        <w:t xml:space="preserve"> Step12:Running Ecoes batch</w:t>
+        <w:br/>
+        <w:drawing>
+          <wp:inline distT="0" distR="0" distB="0" distL="0">
+            <wp:extent cx="5524500" cy="2476500"/>
+            <wp:docPr id="58" name="Drawing 58" descr="Step12:Running Ecoes batch"/>
+            <a:graphic xmlns:a="http://schemas.openxmlformats.org/drawingml/2006/main">
+              <a:graphicData uri="http://schemas.openxmlformats.org/drawingml/2006/picture">
+                <pic:pic xmlns:pic="http://schemas.openxmlformats.org/drawingml/2006/picture">
+                  <pic:nvPicPr>
+                    <pic:cNvPr id="0" name="Picture 58" descr="Step12:Running Ecoes batch"/>
+                    <pic:cNvPicPr>
+                      <a:picLocks noChangeAspect="true"/>
+                    </pic:cNvPicPr>
+                  </pic:nvPicPr>
+                  <pic:blipFill>
+                    <a:blip r:embed="rId60"/>
+                    <a:stretch>
+                      <a:fillRect/>
+                    </a:stretch>
+                  </pic:blipFill>
+                  <pic:spPr>
+                    <a:xfrm>
+                      <a:off x="0" y="0"/>
+                      <a:ext cx="5524500" cy="2476500"/>
+                    </a:xfrm>
+                    <a:prstGeom prst="rect">
+                      <a:avLst/>
+                    </a:prstGeom>
+                  </pic:spPr>
+                </pic:pic>
+              </a:graphicData>
+            </a:graphic>
+          </wp:inline>
+        </w:drawing>
+      </w:r>
+    </w:p>
   </w:body>
 </w:document>
 </file>
</xml_diff>